<commit_message>
Fix collapsed-to-single-column tables in both reports
В makeTable / codeBlock ширины ячеек были заданы в WidthType.PERCENTAGE
без явного columnWidths и без TableLayoutType.FIXED. Word/Google Docs
интерпретировали это как auto-fit и сжимали колонки до ширины одного
символа. Теперь ширина таблицы и каждой колонки задаётся в DXA на
рабочей зоне A4 (9000 twips), layout зафиксирован, в XML появляется
корректный tblGrid с gridCol для каждой колонки.
</commit_message>
<xml_diff>
--- a/Raport_HELIOS_v2.4.docx
+++ b/Raport_HELIOS_v2.4.docx
@@ -568,7 +568,7 @@
     </w:p>
     <w:tbl>
       <w:tblPr>
-        <w:tblW w:type="pct" w:w="100%"/>
+        <w:tblW w:type="dxa" w:w="9000"/>
         <w:tblBorders>
           <w:top w:val="single" w:color="CBD5E1" w:sz="4"/>
           <w:left w:val="single" w:color="CBD5E1" w:sz="4"/>
@@ -577,13 +577,14 @@
           <w:insideH w:val="single" w:color="CBD5E1" w:sz="4"/>
           <w:insideV w:val="single" w:color="CBD5E1" w:sz="4"/>
         </w:tblBorders>
+        <w:tblLayout w:type="fixed"/>
       </w:tblPr>
       <w:tblGrid>
-        <w:gridCol w:w="100"/>
-        <w:gridCol w:w="100"/>
-        <w:gridCol w:w="100"/>
-        <w:gridCol w:w="100"/>
-        <w:gridCol w:w="100"/>
+        <w:gridCol w:w="2520"/>
+        <w:gridCol w:w="1620"/>
+        <w:gridCol w:w="1620"/>
+        <w:gridCol w:w="1620"/>
+        <w:gridCol w:w="1620"/>
       </w:tblGrid>
       <w:tr>
         <w:trPr>
@@ -591,7 +592,7 @@
         </w:trPr>
         <w:tc>
           <w:tcPr>
-            <w:tcW w:type="pct" w:w="28%"/>
+            <w:tcW w:type="dxa" w:w="2520"/>
             <w:shd w:fill="1F2937" w:val="clear"/>
             <w:tcMar>
               <w:top w:type="dxa" w:w="100"/>
@@ -620,7 +621,7 @@
         </w:tc>
         <w:tc>
           <w:tcPr>
-            <w:tcW w:type="pct" w:w="18%"/>
+            <w:tcW w:type="dxa" w:w="1620"/>
             <w:shd w:fill="1F2937" w:val="clear"/>
             <w:tcMar>
               <w:top w:type="dxa" w:w="100"/>
@@ -649,7 +650,7 @@
         </w:tc>
         <w:tc>
           <w:tcPr>
-            <w:tcW w:type="pct" w:w="18%"/>
+            <w:tcW w:type="dxa" w:w="1620"/>
             <w:shd w:fill="1F2937" w:val="clear"/>
             <w:tcMar>
               <w:top w:type="dxa" w:w="100"/>
@@ -678,7 +679,7 @@
         </w:tc>
         <w:tc>
           <w:tcPr>
-            <w:tcW w:type="pct" w:w="18%"/>
+            <w:tcW w:type="dxa" w:w="1620"/>
             <w:shd w:fill="1F2937" w:val="clear"/>
             <w:tcMar>
               <w:top w:type="dxa" w:w="100"/>
@@ -707,7 +708,7 @@
         </w:tc>
         <w:tc>
           <w:tcPr>
-            <w:tcW w:type="pct" w:w="18%"/>
+            <w:tcW w:type="dxa" w:w="1620"/>
             <w:shd w:fill="1F2937" w:val="clear"/>
             <w:tcMar>
               <w:top w:type="dxa" w:w="100"/>
@@ -738,7 +739,7 @@
       <w:tr>
         <w:tc>
           <w:tcPr>
-            <w:tcW w:type="pct" w:w="28%"/>
+            <w:tcW w:type="dxa" w:w="2520"/>
             <w:tcMar>
               <w:top w:type="dxa" w:w="80"/>
               <w:left w:type="dxa" w:w="140"/>
@@ -764,7 +765,7 @@
         </w:tc>
         <w:tc>
           <w:tcPr>
-            <w:tcW w:type="pct" w:w="18%"/>
+            <w:tcW w:type="dxa" w:w="1620"/>
             <w:tcMar>
               <w:top w:type="dxa" w:w="80"/>
               <w:left w:type="dxa" w:w="140"/>
@@ -790,7 +791,7 @@
         </w:tc>
         <w:tc>
           <w:tcPr>
-            <w:tcW w:type="pct" w:w="18%"/>
+            <w:tcW w:type="dxa" w:w="1620"/>
             <w:tcMar>
               <w:top w:type="dxa" w:w="80"/>
               <w:left w:type="dxa" w:w="140"/>
@@ -816,7 +817,7 @@
         </w:tc>
         <w:tc>
           <w:tcPr>
-            <w:tcW w:type="pct" w:w="18%"/>
+            <w:tcW w:type="dxa" w:w="1620"/>
             <w:tcMar>
               <w:top w:type="dxa" w:w="80"/>
               <w:left w:type="dxa" w:w="140"/>
@@ -842,7 +843,7 @@
         </w:tc>
         <w:tc>
           <w:tcPr>
-            <w:tcW w:type="pct" w:w="18%"/>
+            <w:tcW w:type="dxa" w:w="1620"/>
             <w:tcMar>
               <w:top w:type="dxa" w:w="80"/>
               <w:left w:type="dxa" w:w="140"/>
@@ -870,7 +871,7 @@
       <w:tr>
         <w:tc>
           <w:tcPr>
-            <w:tcW w:type="pct" w:w="28%"/>
+            <w:tcW w:type="dxa" w:w="2520"/>
             <w:shd w:fill="F8FAFC" w:val="clear"/>
             <w:tcMar>
               <w:top w:type="dxa" w:w="80"/>
@@ -897,7 +898,7 @@
         </w:tc>
         <w:tc>
           <w:tcPr>
-            <w:tcW w:type="pct" w:w="18%"/>
+            <w:tcW w:type="dxa" w:w="1620"/>
             <w:shd w:fill="F8FAFC" w:val="clear"/>
             <w:tcMar>
               <w:top w:type="dxa" w:w="80"/>
@@ -924,7 +925,7 @@
         </w:tc>
         <w:tc>
           <w:tcPr>
-            <w:tcW w:type="pct" w:w="18%"/>
+            <w:tcW w:type="dxa" w:w="1620"/>
             <w:shd w:fill="F8FAFC" w:val="clear"/>
             <w:tcMar>
               <w:top w:type="dxa" w:w="80"/>
@@ -951,7 +952,7 @@
         </w:tc>
         <w:tc>
           <w:tcPr>
-            <w:tcW w:type="pct" w:w="18%"/>
+            <w:tcW w:type="dxa" w:w="1620"/>
             <w:shd w:fill="F8FAFC" w:val="clear"/>
             <w:tcMar>
               <w:top w:type="dxa" w:w="80"/>
@@ -978,7 +979,7 @@
         </w:tc>
         <w:tc>
           <w:tcPr>
-            <w:tcW w:type="pct" w:w="18%"/>
+            <w:tcW w:type="dxa" w:w="1620"/>
             <w:shd w:fill="F8FAFC" w:val="clear"/>
             <w:tcMar>
               <w:top w:type="dxa" w:w="80"/>
@@ -1007,7 +1008,7 @@
       <w:tr>
         <w:tc>
           <w:tcPr>
-            <w:tcW w:type="pct" w:w="28%"/>
+            <w:tcW w:type="dxa" w:w="2520"/>
             <w:tcMar>
               <w:top w:type="dxa" w:w="80"/>
               <w:left w:type="dxa" w:w="140"/>
@@ -1033,7 +1034,7 @@
         </w:tc>
         <w:tc>
           <w:tcPr>
-            <w:tcW w:type="pct" w:w="18%"/>
+            <w:tcW w:type="dxa" w:w="1620"/>
             <w:tcMar>
               <w:top w:type="dxa" w:w="80"/>
               <w:left w:type="dxa" w:w="140"/>
@@ -1059,7 +1060,7 @@
         </w:tc>
         <w:tc>
           <w:tcPr>
-            <w:tcW w:type="pct" w:w="18%"/>
+            <w:tcW w:type="dxa" w:w="1620"/>
             <w:tcMar>
               <w:top w:type="dxa" w:w="80"/>
               <w:left w:type="dxa" w:w="140"/>
@@ -1085,7 +1086,7 @@
         </w:tc>
         <w:tc>
           <w:tcPr>
-            <w:tcW w:type="pct" w:w="18%"/>
+            <w:tcW w:type="dxa" w:w="1620"/>
             <w:tcMar>
               <w:top w:type="dxa" w:w="80"/>
               <w:left w:type="dxa" w:w="140"/>
@@ -1111,7 +1112,7 @@
         </w:tc>
         <w:tc>
           <w:tcPr>
-            <w:tcW w:type="pct" w:w="18%"/>
+            <w:tcW w:type="dxa" w:w="1620"/>
             <w:tcMar>
               <w:top w:type="dxa" w:w="80"/>
               <w:left w:type="dxa" w:w="140"/>
@@ -1139,7 +1140,7 @@
       <w:tr>
         <w:tc>
           <w:tcPr>
-            <w:tcW w:type="pct" w:w="28%"/>
+            <w:tcW w:type="dxa" w:w="2520"/>
             <w:shd w:fill="F8FAFC" w:val="clear"/>
             <w:tcMar>
               <w:top w:type="dxa" w:w="80"/>
@@ -1166,7 +1167,7 @@
         </w:tc>
         <w:tc>
           <w:tcPr>
-            <w:tcW w:type="pct" w:w="18%"/>
+            <w:tcW w:type="dxa" w:w="1620"/>
             <w:shd w:fill="F8FAFC" w:val="clear"/>
             <w:tcMar>
               <w:top w:type="dxa" w:w="80"/>
@@ -1193,7 +1194,7 @@
         </w:tc>
         <w:tc>
           <w:tcPr>
-            <w:tcW w:type="pct" w:w="18%"/>
+            <w:tcW w:type="dxa" w:w="1620"/>
             <w:shd w:fill="F8FAFC" w:val="clear"/>
             <w:tcMar>
               <w:top w:type="dxa" w:w="80"/>
@@ -1220,7 +1221,7 @@
         </w:tc>
         <w:tc>
           <w:tcPr>
-            <w:tcW w:type="pct" w:w="18%"/>
+            <w:tcW w:type="dxa" w:w="1620"/>
             <w:shd w:fill="F8FAFC" w:val="clear"/>
             <w:tcMar>
               <w:top w:type="dxa" w:w="80"/>
@@ -1247,7 +1248,7 @@
         </w:tc>
         <w:tc>
           <w:tcPr>
-            <w:tcW w:type="pct" w:w="18%"/>
+            <w:tcW w:type="dxa" w:w="1620"/>
             <w:shd w:fill="F8FAFC" w:val="clear"/>
             <w:tcMar>
               <w:top w:type="dxa" w:w="80"/>
@@ -1276,7 +1277,7 @@
       <w:tr>
         <w:tc>
           <w:tcPr>
-            <w:tcW w:type="pct" w:w="28%"/>
+            <w:tcW w:type="dxa" w:w="2520"/>
             <w:tcMar>
               <w:top w:type="dxa" w:w="80"/>
               <w:left w:type="dxa" w:w="140"/>
@@ -1302,7 +1303,7 @@
         </w:tc>
         <w:tc>
           <w:tcPr>
-            <w:tcW w:type="pct" w:w="18%"/>
+            <w:tcW w:type="dxa" w:w="1620"/>
             <w:tcMar>
               <w:top w:type="dxa" w:w="80"/>
               <w:left w:type="dxa" w:w="140"/>
@@ -1328,7 +1329,7 @@
         </w:tc>
         <w:tc>
           <w:tcPr>
-            <w:tcW w:type="pct" w:w="18%"/>
+            <w:tcW w:type="dxa" w:w="1620"/>
             <w:tcMar>
               <w:top w:type="dxa" w:w="80"/>
               <w:left w:type="dxa" w:w="140"/>
@@ -1354,7 +1355,7 @@
         </w:tc>
         <w:tc>
           <w:tcPr>
-            <w:tcW w:type="pct" w:w="18%"/>
+            <w:tcW w:type="dxa" w:w="1620"/>
             <w:tcMar>
               <w:top w:type="dxa" w:w="80"/>
               <w:left w:type="dxa" w:w="140"/>
@@ -1380,7 +1381,7 @@
         </w:tc>
         <w:tc>
           <w:tcPr>
-            <w:tcW w:type="pct" w:w="18%"/>
+            <w:tcW w:type="dxa" w:w="1620"/>
             <w:tcMar>
               <w:top w:type="dxa" w:w="80"/>
               <w:left w:type="dxa" w:w="140"/>
@@ -1408,7 +1409,7 @@
       <w:tr>
         <w:tc>
           <w:tcPr>
-            <w:tcW w:type="pct" w:w="28%"/>
+            <w:tcW w:type="dxa" w:w="2520"/>
             <w:shd w:fill="F8FAFC" w:val="clear"/>
             <w:tcMar>
               <w:top w:type="dxa" w:w="80"/>
@@ -1435,7 +1436,7 @@
         </w:tc>
         <w:tc>
           <w:tcPr>
-            <w:tcW w:type="pct" w:w="18%"/>
+            <w:tcW w:type="dxa" w:w="1620"/>
             <w:shd w:fill="F8FAFC" w:val="clear"/>
             <w:tcMar>
               <w:top w:type="dxa" w:w="80"/>
@@ -1462,7 +1463,7 @@
         </w:tc>
         <w:tc>
           <w:tcPr>
-            <w:tcW w:type="pct" w:w="18%"/>
+            <w:tcW w:type="dxa" w:w="1620"/>
             <w:shd w:fill="F8FAFC" w:val="clear"/>
             <w:tcMar>
               <w:top w:type="dxa" w:w="80"/>
@@ -1489,7 +1490,7 @@
         </w:tc>
         <w:tc>
           <w:tcPr>
-            <w:tcW w:type="pct" w:w="18%"/>
+            <w:tcW w:type="dxa" w:w="1620"/>
             <w:shd w:fill="F8FAFC" w:val="clear"/>
             <w:tcMar>
               <w:top w:type="dxa" w:w="80"/>
@@ -1516,7 +1517,7 @@
         </w:tc>
         <w:tc>
           <w:tcPr>
-            <w:tcW w:type="pct" w:w="18%"/>
+            <w:tcW w:type="dxa" w:w="1620"/>
             <w:shd w:fill="F8FAFC" w:val="clear"/>
             <w:tcMar>
               <w:top w:type="dxa" w:w="80"/>
@@ -1545,7 +1546,7 @@
       <w:tr>
         <w:tc>
           <w:tcPr>
-            <w:tcW w:type="pct" w:w="28%"/>
+            <w:tcW w:type="dxa" w:w="2520"/>
             <w:tcMar>
               <w:top w:type="dxa" w:w="80"/>
               <w:left w:type="dxa" w:w="140"/>
@@ -1571,7 +1572,7 @@
         </w:tc>
         <w:tc>
           <w:tcPr>
-            <w:tcW w:type="pct" w:w="18%"/>
+            <w:tcW w:type="dxa" w:w="1620"/>
             <w:tcMar>
               <w:top w:type="dxa" w:w="80"/>
               <w:left w:type="dxa" w:w="140"/>
@@ -1597,7 +1598,7 @@
         </w:tc>
         <w:tc>
           <w:tcPr>
-            <w:tcW w:type="pct" w:w="18%"/>
+            <w:tcW w:type="dxa" w:w="1620"/>
             <w:tcMar>
               <w:top w:type="dxa" w:w="80"/>
               <w:left w:type="dxa" w:w="140"/>
@@ -1623,7 +1624,7 @@
         </w:tc>
         <w:tc>
           <w:tcPr>
-            <w:tcW w:type="pct" w:w="18%"/>
+            <w:tcW w:type="dxa" w:w="1620"/>
             <w:tcMar>
               <w:top w:type="dxa" w:w="80"/>
               <w:left w:type="dxa" w:w="140"/>
@@ -1649,7 +1650,7 @@
         </w:tc>
         <w:tc>
           <w:tcPr>
-            <w:tcW w:type="pct" w:w="18%"/>
+            <w:tcW w:type="dxa" w:w="1620"/>
             <w:tcMar>
               <w:top w:type="dxa" w:w="80"/>
               <w:left w:type="dxa" w:w="140"/>
@@ -1677,7 +1678,7 @@
       <w:tr>
         <w:tc>
           <w:tcPr>
-            <w:tcW w:type="pct" w:w="28%"/>
+            <w:tcW w:type="dxa" w:w="2520"/>
             <w:shd w:fill="F8FAFC" w:val="clear"/>
             <w:tcMar>
               <w:top w:type="dxa" w:w="80"/>
@@ -1704,7 +1705,7 @@
         </w:tc>
         <w:tc>
           <w:tcPr>
-            <w:tcW w:type="pct" w:w="18%"/>
+            <w:tcW w:type="dxa" w:w="1620"/>
             <w:shd w:fill="F8FAFC" w:val="clear"/>
             <w:tcMar>
               <w:top w:type="dxa" w:w="80"/>
@@ -1731,7 +1732,7 @@
         </w:tc>
         <w:tc>
           <w:tcPr>
-            <w:tcW w:type="pct" w:w="18%"/>
+            <w:tcW w:type="dxa" w:w="1620"/>
             <w:shd w:fill="F8FAFC" w:val="clear"/>
             <w:tcMar>
               <w:top w:type="dxa" w:w="80"/>
@@ -1758,7 +1759,7 @@
         </w:tc>
         <w:tc>
           <w:tcPr>
-            <w:tcW w:type="pct" w:w="18%"/>
+            <w:tcW w:type="dxa" w:w="1620"/>
             <w:shd w:fill="F8FAFC" w:val="clear"/>
             <w:tcMar>
               <w:top w:type="dxa" w:w="80"/>
@@ -1785,7 +1786,7 @@
         </w:tc>
         <w:tc>
           <w:tcPr>
-            <w:tcW w:type="pct" w:w="18%"/>
+            <w:tcW w:type="dxa" w:w="1620"/>
             <w:shd w:fill="F8FAFC" w:val="clear"/>
             <w:tcMar>
               <w:top w:type="dxa" w:w="80"/>
@@ -1814,7 +1815,7 @@
       <w:tr>
         <w:tc>
           <w:tcPr>
-            <w:tcW w:type="pct" w:w="28%"/>
+            <w:tcW w:type="dxa" w:w="2520"/>
             <w:tcMar>
               <w:top w:type="dxa" w:w="80"/>
               <w:left w:type="dxa" w:w="140"/>
@@ -1840,7 +1841,7 @@
         </w:tc>
         <w:tc>
           <w:tcPr>
-            <w:tcW w:type="pct" w:w="18%"/>
+            <w:tcW w:type="dxa" w:w="1620"/>
             <w:tcMar>
               <w:top w:type="dxa" w:w="80"/>
               <w:left w:type="dxa" w:w="140"/>
@@ -1866,7 +1867,7 @@
         </w:tc>
         <w:tc>
           <w:tcPr>
-            <w:tcW w:type="pct" w:w="18%"/>
+            <w:tcW w:type="dxa" w:w="1620"/>
             <w:tcMar>
               <w:top w:type="dxa" w:w="80"/>
               <w:left w:type="dxa" w:w="140"/>
@@ -1892,7 +1893,7 @@
         </w:tc>
         <w:tc>
           <w:tcPr>
-            <w:tcW w:type="pct" w:w="18%"/>
+            <w:tcW w:type="dxa" w:w="1620"/>
             <w:tcMar>
               <w:top w:type="dxa" w:w="80"/>
               <w:left w:type="dxa" w:w="140"/>
@@ -1918,7 +1919,7 @@
         </w:tc>
         <w:tc>
           <w:tcPr>
-            <w:tcW w:type="pct" w:w="18%"/>
+            <w:tcW w:type="dxa" w:w="1620"/>
             <w:tcMar>
               <w:top w:type="dxa" w:w="80"/>
               <w:left w:type="dxa" w:w="140"/>
@@ -2306,7 +2307,7 @@
     </w:p>
     <w:tbl>
       <w:tblPr>
-        <w:tblW w:type="pct" w:w="100%"/>
+        <w:tblW w:type="dxa" w:w="9000"/>
         <w:tblBorders>
           <w:top w:val="single" w:color="CBD5E1" w:sz="4"/>
           <w:left w:val="single" w:color="CBD5E1" w:sz="4"/>
@@ -2315,12 +2316,13 @@
           <w:insideH w:val="single" w:color="CBD5E1" w:sz="4"/>
           <w:insideV w:val="single" w:color="CBD5E1" w:sz="4"/>
         </w:tblBorders>
+        <w:tblLayout w:type="fixed"/>
       </w:tblPr>
       <w:tblGrid>
-        <w:gridCol w:w="100"/>
-        <w:gridCol w:w="100"/>
-        <w:gridCol w:w="100"/>
-        <w:gridCol w:w="100"/>
+        <w:gridCol w:w="2700"/>
+        <w:gridCol w:w="1620"/>
+        <w:gridCol w:w="1620"/>
+        <w:gridCol w:w="3060"/>
       </w:tblGrid>
       <w:tr>
         <w:trPr>
@@ -2328,7 +2330,7 @@
         </w:trPr>
         <w:tc>
           <w:tcPr>
-            <w:tcW w:type="pct" w:w="30%"/>
+            <w:tcW w:type="dxa" w:w="2700"/>
             <w:shd w:fill="1F2937" w:val="clear"/>
             <w:tcMar>
               <w:top w:type="dxa" w:w="100"/>
@@ -2357,7 +2359,7 @@
         </w:tc>
         <w:tc>
           <w:tcPr>
-            <w:tcW w:type="pct" w:w="18%"/>
+            <w:tcW w:type="dxa" w:w="1620"/>
             <w:shd w:fill="1F2937" w:val="clear"/>
             <w:tcMar>
               <w:top w:type="dxa" w:w="100"/>
@@ -2386,7 +2388,7 @@
         </w:tc>
         <w:tc>
           <w:tcPr>
-            <w:tcW w:type="pct" w:w="18%"/>
+            <w:tcW w:type="dxa" w:w="1620"/>
             <w:shd w:fill="1F2937" w:val="clear"/>
             <w:tcMar>
               <w:top w:type="dxa" w:w="100"/>
@@ -2415,7 +2417,7 @@
         </w:tc>
         <w:tc>
           <w:tcPr>
-            <w:tcW w:type="pct" w:w="34%"/>
+            <w:tcW w:type="dxa" w:w="3060"/>
             <w:shd w:fill="1F2937" w:val="clear"/>
             <w:tcMar>
               <w:top w:type="dxa" w:w="100"/>
@@ -2446,7 +2448,7 @@
       <w:tr>
         <w:tc>
           <w:tcPr>
-            <w:tcW w:type="pct" w:w="30%"/>
+            <w:tcW w:type="dxa" w:w="2700"/>
             <w:tcMar>
               <w:top w:type="dxa" w:w="80"/>
               <w:left w:type="dxa" w:w="140"/>
@@ -2472,7 +2474,7 @@
         </w:tc>
         <w:tc>
           <w:tcPr>
-            <w:tcW w:type="pct" w:w="18%"/>
+            <w:tcW w:type="dxa" w:w="1620"/>
             <w:tcMar>
               <w:top w:type="dxa" w:w="80"/>
               <w:left w:type="dxa" w:w="140"/>
@@ -2498,7 +2500,7 @@
         </w:tc>
         <w:tc>
           <w:tcPr>
-            <w:tcW w:type="pct" w:w="18%"/>
+            <w:tcW w:type="dxa" w:w="1620"/>
             <w:tcMar>
               <w:top w:type="dxa" w:w="80"/>
               <w:left w:type="dxa" w:w="140"/>
@@ -2524,7 +2526,7 @@
         </w:tc>
         <w:tc>
           <w:tcPr>
-            <w:tcW w:type="pct" w:w="34%"/>
+            <w:tcW w:type="dxa" w:w="3060"/>
             <w:tcMar>
               <w:top w:type="dxa" w:w="80"/>
               <w:left w:type="dxa" w:w="140"/>
@@ -2552,7 +2554,7 @@
       <w:tr>
         <w:tc>
           <w:tcPr>
-            <w:tcW w:type="pct" w:w="30%"/>
+            <w:tcW w:type="dxa" w:w="2700"/>
             <w:shd w:fill="F8FAFC" w:val="clear"/>
             <w:tcMar>
               <w:top w:type="dxa" w:w="80"/>
@@ -2579,7 +2581,7 @@
         </w:tc>
         <w:tc>
           <w:tcPr>
-            <w:tcW w:type="pct" w:w="18%"/>
+            <w:tcW w:type="dxa" w:w="1620"/>
             <w:shd w:fill="F8FAFC" w:val="clear"/>
             <w:tcMar>
               <w:top w:type="dxa" w:w="80"/>
@@ -2606,7 +2608,7 @@
         </w:tc>
         <w:tc>
           <w:tcPr>
-            <w:tcW w:type="pct" w:w="18%"/>
+            <w:tcW w:type="dxa" w:w="1620"/>
             <w:shd w:fill="F8FAFC" w:val="clear"/>
             <w:tcMar>
               <w:top w:type="dxa" w:w="80"/>
@@ -2633,7 +2635,7 @@
         </w:tc>
         <w:tc>
           <w:tcPr>
-            <w:tcW w:type="pct" w:w="34%"/>
+            <w:tcW w:type="dxa" w:w="3060"/>
             <w:shd w:fill="F8FAFC" w:val="clear"/>
             <w:tcMar>
               <w:top w:type="dxa" w:w="80"/>
@@ -2662,7 +2664,7 @@
       <w:tr>
         <w:tc>
           <w:tcPr>
-            <w:tcW w:type="pct" w:w="30%"/>
+            <w:tcW w:type="dxa" w:w="2700"/>
             <w:tcMar>
               <w:top w:type="dxa" w:w="80"/>
               <w:left w:type="dxa" w:w="140"/>
@@ -2688,7 +2690,7 @@
         </w:tc>
         <w:tc>
           <w:tcPr>
-            <w:tcW w:type="pct" w:w="18%"/>
+            <w:tcW w:type="dxa" w:w="1620"/>
             <w:tcMar>
               <w:top w:type="dxa" w:w="80"/>
               <w:left w:type="dxa" w:w="140"/>
@@ -2714,7 +2716,7 @@
         </w:tc>
         <w:tc>
           <w:tcPr>
-            <w:tcW w:type="pct" w:w="18%"/>
+            <w:tcW w:type="dxa" w:w="1620"/>
             <w:tcMar>
               <w:top w:type="dxa" w:w="80"/>
               <w:left w:type="dxa" w:w="140"/>
@@ -2740,7 +2742,7 @@
         </w:tc>
         <w:tc>
           <w:tcPr>
-            <w:tcW w:type="pct" w:w="34%"/>
+            <w:tcW w:type="dxa" w:w="3060"/>
             <w:tcMar>
               <w:top w:type="dxa" w:w="80"/>
               <w:left w:type="dxa" w:w="140"/>
@@ -3059,7 +3061,7 @@
     </w:p>
     <w:tbl>
       <w:tblPr>
-        <w:tblW w:type="pct" w:w="100%"/>
+        <w:tblW w:type="dxa" w:w="9000"/>
         <w:tblBorders>
           <w:top w:val="single" w:color="CBD5E1" w:sz="4"/>
           <w:left w:val="single" w:color="CBD5E1" w:sz="4"/>
@@ -3068,12 +3070,13 @@
           <w:insideH w:val="single" w:color="CBD5E1" w:sz="4"/>
           <w:insideV w:val="single" w:color="CBD5E1" w:sz="4"/>
         </w:tblBorders>
+        <w:tblLayout w:type="fixed"/>
       </w:tblPr>
       <w:tblGrid>
-        <w:gridCol w:w="100"/>
-        <w:gridCol w:w="100"/>
-        <w:gridCol w:w="100"/>
-        <w:gridCol w:w="100"/>
+        <w:gridCol w:w="1980"/>
+        <w:gridCol w:w="3420"/>
+        <w:gridCol w:w="1260"/>
+        <w:gridCol w:w="2340"/>
       </w:tblGrid>
       <w:tr>
         <w:trPr>
@@ -3081,7 +3084,7 @@
         </w:trPr>
         <w:tc>
           <w:tcPr>
-            <w:tcW w:type="pct" w:w="22%"/>
+            <w:tcW w:type="dxa" w:w="1980"/>
             <w:shd w:fill="1F2937" w:val="clear"/>
             <w:tcMar>
               <w:top w:type="dxa" w:w="100"/>
@@ -3110,7 +3113,7 @@
         </w:tc>
         <w:tc>
           <w:tcPr>
-            <w:tcW w:type="pct" w:w="38%"/>
+            <w:tcW w:type="dxa" w:w="3420"/>
             <w:shd w:fill="1F2937" w:val="clear"/>
             <w:tcMar>
               <w:top w:type="dxa" w:w="100"/>
@@ -3139,7 +3142,7 @@
         </w:tc>
         <w:tc>
           <w:tcPr>
-            <w:tcW w:type="pct" w:w="14%"/>
+            <w:tcW w:type="dxa" w:w="1260"/>
             <w:shd w:fill="1F2937" w:val="clear"/>
             <w:tcMar>
               <w:top w:type="dxa" w:w="100"/>
@@ -3168,7 +3171,7 @@
         </w:tc>
         <w:tc>
           <w:tcPr>
-            <w:tcW w:type="pct" w:w="26%"/>
+            <w:tcW w:type="dxa" w:w="2340"/>
             <w:shd w:fill="1F2937" w:val="clear"/>
             <w:tcMar>
               <w:top w:type="dxa" w:w="100"/>
@@ -3199,7 +3202,7 @@
       <w:tr>
         <w:tc>
           <w:tcPr>
-            <w:tcW w:type="pct" w:w="22%"/>
+            <w:tcW w:type="dxa" w:w="1980"/>
             <w:tcMar>
               <w:top w:type="dxa" w:w="80"/>
               <w:left w:type="dxa" w:w="140"/>
@@ -3225,7 +3228,7 @@
         </w:tc>
         <w:tc>
           <w:tcPr>
-            <w:tcW w:type="pct" w:w="38%"/>
+            <w:tcW w:type="dxa" w:w="3420"/>
             <w:tcMar>
               <w:top w:type="dxa" w:w="80"/>
               <w:left w:type="dxa" w:w="140"/>
@@ -3251,7 +3254,7 @@
         </w:tc>
         <w:tc>
           <w:tcPr>
-            <w:tcW w:type="pct" w:w="14%"/>
+            <w:tcW w:type="dxa" w:w="1260"/>
             <w:tcMar>
               <w:top w:type="dxa" w:w="80"/>
               <w:left w:type="dxa" w:w="140"/>
@@ -3277,7 +3280,7 @@
         </w:tc>
         <w:tc>
           <w:tcPr>
-            <w:tcW w:type="pct" w:w="26%"/>
+            <w:tcW w:type="dxa" w:w="2340"/>
             <w:tcMar>
               <w:top w:type="dxa" w:w="80"/>
               <w:left w:type="dxa" w:w="140"/>
@@ -3305,7 +3308,7 @@
       <w:tr>
         <w:tc>
           <w:tcPr>
-            <w:tcW w:type="pct" w:w="22%"/>
+            <w:tcW w:type="dxa" w:w="1980"/>
             <w:shd w:fill="F8FAFC" w:val="clear"/>
             <w:tcMar>
               <w:top w:type="dxa" w:w="80"/>
@@ -3332,7 +3335,7 @@
         </w:tc>
         <w:tc>
           <w:tcPr>
-            <w:tcW w:type="pct" w:w="38%"/>
+            <w:tcW w:type="dxa" w:w="3420"/>
             <w:shd w:fill="F8FAFC" w:val="clear"/>
             <w:tcMar>
               <w:top w:type="dxa" w:w="80"/>
@@ -3359,7 +3362,7 @@
         </w:tc>
         <w:tc>
           <w:tcPr>
-            <w:tcW w:type="pct" w:w="14%"/>
+            <w:tcW w:type="dxa" w:w="1260"/>
             <w:shd w:fill="F8FAFC" w:val="clear"/>
             <w:tcMar>
               <w:top w:type="dxa" w:w="80"/>
@@ -3386,7 +3389,7 @@
         </w:tc>
         <w:tc>
           <w:tcPr>
-            <w:tcW w:type="pct" w:w="26%"/>
+            <w:tcW w:type="dxa" w:w="2340"/>
             <w:shd w:fill="F8FAFC" w:val="clear"/>
             <w:tcMar>
               <w:top w:type="dxa" w:w="80"/>
@@ -3415,7 +3418,7 @@
       <w:tr>
         <w:tc>
           <w:tcPr>
-            <w:tcW w:type="pct" w:w="22%"/>
+            <w:tcW w:type="dxa" w:w="1980"/>
             <w:tcMar>
               <w:top w:type="dxa" w:w="80"/>
               <w:left w:type="dxa" w:w="140"/>
@@ -3441,7 +3444,7 @@
         </w:tc>
         <w:tc>
           <w:tcPr>
-            <w:tcW w:type="pct" w:w="38%"/>
+            <w:tcW w:type="dxa" w:w="3420"/>
             <w:tcMar>
               <w:top w:type="dxa" w:w="80"/>
               <w:left w:type="dxa" w:w="140"/>
@@ -3467,7 +3470,7 @@
         </w:tc>
         <w:tc>
           <w:tcPr>
-            <w:tcW w:type="pct" w:w="14%"/>
+            <w:tcW w:type="dxa" w:w="1260"/>
             <w:tcMar>
               <w:top w:type="dxa" w:w="80"/>
               <w:left w:type="dxa" w:w="140"/>
@@ -3493,7 +3496,7 @@
         </w:tc>
         <w:tc>
           <w:tcPr>
-            <w:tcW w:type="pct" w:w="26%"/>
+            <w:tcW w:type="dxa" w:w="2340"/>
             <w:tcMar>
               <w:top w:type="dxa" w:w="80"/>
               <w:left w:type="dxa" w:w="140"/>
@@ -3589,7 +3592,7 @@
     </w:p>
     <w:tbl>
       <w:tblPr>
-        <w:tblW w:type="pct" w:w="100%"/>
+        <w:tblW w:type="dxa" w:w="9000"/>
         <w:tblBorders>
           <w:top w:val="single" w:color="auto" w:sz="4"/>
           <w:left w:val="single" w:color="auto" w:sz="4"/>
@@ -3598,14 +3601,15 @@
           <w:insideH w:val="single" w:color="auto" w:sz="4"/>
           <w:insideV w:val="single" w:color="auto" w:sz="4"/>
         </w:tblBorders>
+        <w:tblLayout w:type="fixed"/>
       </w:tblPr>
       <w:tblGrid>
-        <w:gridCol w:w="100"/>
+        <w:gridCol w:w="9000"/>
       </w:tblGrid>
       <w:tr>
         <w:tc>
           <w:tcPr>
-            <w:tcW w:type="pct" w:w="100%"/>
+            <w:tcW w:type="dxa" w:w="9000"/>
             <w:tcBorders>
               <w:top w:val="none" w:color="FFFFFF" w:sz="0"/>
               <w:left w:val="none" w:color="FFFFFF" w:sz="0"/>
@@ -3641,7 +3645,7 @@
       <w:tr>
         <w:tc>
           <w:tcPr>
-            <w:tcW w:type="pct" w:w="100%"/>
+            <w:tcW w:type="dxa" w:w="9000"/>
             <w:tcBorders>
               <w:top w:val="none" w:color="FFFFFF" w:sz="0"/>
               <w:left w:val="single" w:color="EA580C" w:sz="24"/>
@@ -3675,7 +3679,7 @@
       <w:tr>
         <w:tc>
           <w:tcPr>
-            <w:tcW w:type="pct" w:w="100%"/>
+            <w:tcW w:type="dxa" w:w="9000"/>
             <w:tcBorders>
               <w:top w:val="none" w:color="FFFFFF" w:sz="0"/>
               <w:left w:val="single" w:color="EA580C" w:sz="24"/>
@@ -3709,7 +3713,7 @@
       <w:tr>
         <w:tc>
           <w:tcPr>
-            <w:tcW w:type="pct" w:w="100%"/>
+            <w:tcW w:type="dxa" w:w="9000"/>
             <w:tcBorders>
               <w:top w:val="none" w:color="FFFFFF" w:sz="0"/>
               <w:left w:val="single" w:color="EA580C" w:sz="24"/>
@@ -3743,7 +3747,7 @@
       <w:tr>
         <w:tc>
           <w:tcPr>
-            <w:tcW w:type="pct" w:w="100%"/>
+            <w:tcW w:type="dxa" w:w="9000"/>
             <w:tcBorders>
               <w:top w:val="none" w:color="FFFFFF" w:sz="0"/>
               <w:left w:val="single" w:color="EA580C" w:sz="24"/>
@@ -3777,7 +3781,7 @@
       <w:tr>
         <w:tc>
           <w:tcPr>
-            <w:tcW w:type="pct" w:w="100%"/>
+            <w:tcW w:type="dxa" w:w="9000"/>
             <w:tcBorders>
               <w:top w:val="none" w:color="FFFFFF" w:sz="0"/>
               <w:left w:val="single" w:color="EA580C" w:sz="24"/>
@@ -3811,7 +3815,7 @@
       <w:tr>
         <w:tc>
           <w:tcPr>
-            <w:tcW w:type="pct" w:w="100%"/>
+            <w:tcW w:type="dxa" w:w="9000"/>
             <w:tcBorders>
               <w:top w:val="none" w:color="FFFFFF" w:sz="0"/>
               <w:left w:val="single" w:color="EA580C" w:sz="24"/>
@@ -3931,7 +3935,7 @@
     </w:p>
     <w:tbl>
       <w:tblPr>
-        <w:tblW w:type="pct" w:w="100%"/>
+        <w:tblW w:type="dxa" w:w="9000"/>
         <w:tblBorders>
           <w:top w:val="single" w:color="CBD5E1" w:sz="4"/>
           <w:left w:val="single" w:color="CBD5E1" w:sz="4"/>
@@ -3940,11 +3944,12 @@
           <w:insideH w:val="single" w:color="CBD5E1" w:sz="4"/>
           <w:insideV w:val="single" w:color="CBD5E1" w:sz="4"/>
         </w:tblBorders>
+        <w:tblLayout w:type="fixed"/>
       </w:tblPr>
       <w:tblGrid>
-        <w:gridCol w:w="100"/>
-        <w:gridCol w:w="100"/>
-        <w:gridCol w:w="100"/>
+        <w:gridCol w:w="2250"/>
+        <w:gridCol w:w="4500"/>
+        <w:gridCol w:w="2250"/>
       </w:tblGrid>
       <w:tr>
         <w:trPr>
@@ -3952,7 +3957,7 @@
         </w:trPr>
         <w:tc>
           <w:tcPr>
-            <w:tcW w:type="pct" w:w="25%"/>
+            <w:tcW w:type="dxa" w:w="2250"/>
             <w:shd w:fill="1F2937" w:val="clear"/>
             <w:tcMar>
               <w:top w:type="dxa" w:w="100"/>
@@ -3981,7 +3986,7 @@
         </w:tc>
         <w:tc>
           <w:tcPr>
-            <w:tcW w:type="pct" w:w="50%"/>
+            <w:tcW w:type="dxa" w:w="4500"/>
             <w:shd w:fill="1F2937" w:val="clear"/>
             <w:tcMar>
               <w:top w:type="dxa" w:w="100"/>
@@ -4010,7 +4015,7 @@
         </w:tc>
         <w:tc>
           <w:tcPr>
-            <w:tcW w:type="pct" w:w="25%"/>
+            <w:tcW w:type="dxa" w:w="2250"/>
             <w:shd w:fill="1F2937" w:val="clear"/>
             <w:tcMar>
               <w:top w:type="dxa" w:w="100"/>
@@ -4041,7 +4046,7 @@
       <w:tr>
         <w:tc>
           <w:tcPr>
-            <w:tcW w:type="pct" w:w="25%"/>
+            <w:tcW w:type="dxa" w:w="2250"/>
             <w:tcMar>
               <w:top w:type="dxa" w:w="80"/>
               <w:left w:type="dxa" w:w="140"/>
@@ -4067,7 +4072,7 @@
         </w:tc>
         <w:tc>
           <w:tcPr>
-            <w:tcW w:type="pct" w:w="50%"/>
+            <w:tcW w:type="dxa" w:w="4500"/>
             <w:tcMar>
               <w:top w:type="dxa" w:w="80"/>
               <w:left w:type="dxa" w:w="140"/>
@@ -4093,7 +4098,7 @@
         </w:tc>
         <w:tc>
           <w:tcPr>
-            <w:tcW w:type="pct" w:w="25%"/>
+            <w:tcW w:type="dxa" w:w="2250"/>
             <w:tcMar>
               <w:top w:type="dxa" w:w="80"/>
               <w:left w:type="dxa" w:w="140"/>
@@ -4121,7 +4126,7 @@
       <w:tr>
         <w:tc>
           <w:tcPr>
-            <w:tcW w:type="pct" w:w="25%"/>
+            <w:tcW w:type="dxa" w:w="2250"/>
             <w:shd w:fill="F8FAFC" w:val="clear"/>
             <w:tcMar>
               <w:top w:type="dxa" w:w="80"/>
@@ -4148,7 +4153,7 @@
         </w:tc>
         <w:tc>
           <w:tcPr>
-            <w:tcW w:type="pct" w:w="50%"/>
+            <w:tcW w:type="dxa" w:w="4500"/>
             <w:shd w:fill="F8FAFC" w:val="clear"/>
             <w:tcMar>
               <w:top w:type="dxa" w:w="80"/>
@@ -4175,7 +4180,7 @@
         </w:tc>
         <w:tc>
           <w:tcPr>
-            <w:tcW w:type="pct" w:w="25%"/>
+            <w:tcW w:type="dxa" w:w="2250"/>
             <w:shd w:fill="F8FAFC" w:val="clear"/>
             <w:tcMar>
               <w:top w:type="dxa" w:w="80"/>
@@ -4204,7 +4209,7 @@
       <w:tr>
         <w:tc>
           <w:tcPr>
-            <w:tcW w:type="pct" w:w="25%"/>
+            <w:tcW w:type="dxa" w:w="2250"/>
             <w:tcMar>
               <w:top w:type="dxa" w:w="80"/>
               <w:left w:type="dxa" w:w="140"/>
@@ -4230,7 +4235,7 @@
         </w:tc>
         <w:tc>
           <w:tcPr>
-            <w:tcW w:type="pct" w:w="50%"/>
+            <w:tcW w:type="dxa" w:w="4500"/>
             <w:tcMar>
               <w:top w:type="dxa" w:w="80"/>
               <w:left w:type="dxa" w:w="140"/>
@@ -4256,7 +4261,7 @@
         </w:tc>
         <w:tc>
           <w:tcPr>
-            <w:tcW w:type="pct" w:w="25%"/>
+            <w:tcW w:type="dxa" w:w="2250"/>
             <w:tcMar>
               <w:top w:type="dxa" w:w="80"/>
               <w:left w:type="dxa" w:w="140"/>
@@ -4284,7 +4289,7 @@
       <w:tr>
         <w:tc>
           <w:tcPr>
-            <w:tcW w:type="pct" w:w="25%"/>
+            <w:tcW w:type="dxa" w:w="2250"/>
             <w:shd w:fill="F8FAFC" w:val="clear"/>
             <w:tcMar>
               <w:top w:type="dxa" w:w="80"/>
@@ -4311,7 +4316,7 @@
         </w:tc>
         <w:tc>
           <w:tcPr>
-            <w:tcW w:type="pct" w:w="50%"/>
+            <w:tcW w:type="dxa" w:w="4500"/>
             <w:shd w:fill="F8FAFC" w:val="clear"/>
             <w:tcMar>
               <w:top w:type="dxa" w:w="80"/>
@@ -4338,7 +4343,7 @@
         </w:tc>
         <w:tc>
           <w:tcPr>
-            <w:tcW w:type="pct" w:w="25%"/>
+            <w:tcW w:type="dxa" w:w="2250"/>
             <w:shd w:fill="F8FAFC" w:val="clear"/>
             <w:tcMar>
               <w:top w:type="dxa" w:w="80"/>
@@ -4367,7 +4372,7 @@
       <w:tr>
         <w:tc>
           <w:tcPr>
-            <w:tcW w:type="pct" w:w="25%"/>
+            <w:tcW w:type="dxa" w:w="2250"/>
             <w:tcMar>
               <w:top w:type="dxa" w:w="80"/>
               <w:left w:type="dxa" w:w="140"/>
@@ -4393,7 +4398,7 @@
         </w:tc>
         <w:tc>
           <w:tcPr>
-            <w:tcW w:type="pct" w:w="50%"/>
+            <w:tcW w:type="dxa" w:w="4500"/>
             <w:tcMar>
               <w:top w:type="dxa" w:w="80"/>
               <w:left w:type="dxa" w:w="140"/>
@@ -4419,7 +4424,7 @@
         </w:tc>
         <w:tc>
           <w:tcPr>
-            <w:tcW w:type="pct" w:w="25%"/>
+            <w:tcW w:type="dxa" w:w="2250"/>
             <w:tcMar>
               <w:top w:type="dxa" w:w="80"/>
               <w:left w:type="dxa" w:w="140"/>
@@ -4447,7 +4452,7 @@
       <w:tr>
         <w:tc>
           <w:tcPr>
-            <w:tcW w:type="pct" w:w="25%"/>
+            <w:tcW w:type="dxa" w:w="2250"/>
             <w:shd w:fill="F8FAFC" w:val="clear"/>
             <w:tcMar>
               <w:top w:type="dxa" w:w="80"/>
@@ -4474,7 +4479,7 @@
         </w:tc>
         <w:tc>
           <w:tcPr>
-            <w:tcW w:type="pct" w:w="50%"/>
+            <w:tcW w:type="dxa" w:w="4500"/>
             <w:shd w:fill="F8FAFC" w:val="clear"/>
             <w:tcMar>
               <w:top w:type="dxa" w:w="80"/>
@@ -4501,7 +4506,7 @@
         </w:tc>
         <w:tc>
           <w:tcPr>
-            <w:tcW w:type="pct" w:w="25%"/>
+            <w:tcW w:type="dxa" w:w="2250"/>
             <w:shd w:fill="F8FAFC" w:val="clear"/>
             <w:tcMar>
               <w:top w:type="dxa" w:w="80"/>
@@ -4550,7 +4555,7 @@
     </w:p>
     <w:tbl>
       <w:tblPr>
-        <w:tblW w:type="pct" w:w="100%"/>
+        <w:tblW w:type="dxa" w:w="9000"/>
         <w:tblBorders>
           <w:top w:val="single" w:color="auto" w:sz="4"/>
           <w:left w:val="single" w:color="auto" w:sz="4"/>
@@ -4559,14 +4564,15 @@
           <w:insideH w:val="single" w:color="auto" w:sz="4"/>
           <w:insideV w:val="single" w:color="auto" w:sz="4"/>
         </w:tblBorders>
+        <w:tblLayout w:type="fixed"/>
       </w:tblPr>
       <w:tblGrid>
-        <w:gridCol w:w="100"/>
+        <w:gridCol w:w="9000"/>
       </w:tblGrid>
       <w:tr>
         <w:tc>
           <w:tcPr>
-            <w:tcW w:type="pct" w:w="100%"/>
+            <w:tcW w:type="dxa" w:w="9000"/>
             <w:tcBorders>
               <w:top w:val="none" w:color="FFFFFF" w:sz="0"/>
               <w:left w:val="none" w:color="FFFFFF" w:sz="0"/>
@@ -4602,7 +4608,7 @@
       <w:tr>
         <w:tc>
           <w:tcPr>
-            <w:tcW w:type="pct" w:w="100%"/>
+            <w:tcW w:type="dxa" w:w="9000"/>
             <w:tcBorders>
               <w:top w:val="none" w:color="FFFFFF" w:sz="0"/>
               <w:left w:val="single" w:color="EA580C" w:sz="24"/>
@@ -4636,7 +4642,7 @@
       <w:tr>
         <w:tc>
           <w:tcPr>
-            <w:tcW w:type="pct" w:w="100%"/>
+            <w:tcW w:type="dxa" w:w="9000"/>
             <w:tcBorders>
               <w:top w:val="none" w:color="FFFFFF" w:sz="0"/>
               <w:left w:val="single" w:color="EA580C" w:sz="24"/>
@@ -4670,7 +4676,7 @@
       <w:tr>
         <w:tc>
           <w:tcPr>
-            <w:tcW w:type="pct" w:w="100%"/>
+            <w:tcW w:type="dxa" w:w="9000"/>
             <w:tcBorders>
               <w:top w:val="none" w:color="FFFFFF" w:sz="0"/>
               <w:left w:val="single" w:color="EA580C" w:sz="24"/>
@@ -4704,7 +4710,7 @@
       <w:tr>
         <w:tc>
           <w:tcPr>
-            <w:tcW w:type="pct" w:w="100%"/>
+            <w:tcW w:type="dxa" w:w="9000"/>
             <w:tcBorders>
               <w:top w:val="none" w:color="FFFFFF" w:sz="0"/>
               <w:left w:val="single" w:color="EA580C" w:sz="24"/>
@@ -4738,7 +4744,7 @@
       <w:tr>
         <w:tc>
           <w:tcPr>
-            <w:tcW w:type="pct" w:w="100%"/>
+            <w:tcW w:type="dxa" w:w="9000"/>
             <w:tcBorders>
               <w:top w:val="none" w:color="FFFFFF" w:sz="0"/>
               <w:left w:val="single" w:color="EA580C" w:sz="24"/>
@@ -4772,7 +4778,7 @@
       <w:tr>
         <w:tc>
           <w:tcPr>
-            <w:tcW w:type="pct" w:w="100%"/>
+            <w:tcW w:type="dxa" w:w="9000"/>
             <w:tcBorders>
               <w:top w:val="none" w:color="FFFFFF" w:sz="0"/>
               <w:left w:val="single" w:color="EA580C" w:sz="24"/>
@@ -4806,7 +4812,7 @@
       <w:tr>
         <w:tc>
           <w:tcPr>
-            <w:tcW w:type="pct" w:w="100%"/>
+            <w:tcW w:type="dxa" w:w="9000"/>
             <w:tcBorders>
               <w:top w:val="none" w:color="FFFFFF" w:sz="0"/>
               <w:left w:val="single" w:color="EA580C" w:sz="24"/>
@@ -4840,7 +4846,7 @@
       <w:tr>
         <w:tc>
           <w:tcPr>
-            <w:tcW w:type="pct" w:w="100%"/>
+            <w:tcW w:type="dxa" w:w="9000"/>
             <w:tcBorders>
               <w:top w:val="none" w:color="FFFFFF" w:sz="0"/>
               <w:left w:val="single" w:color="EA580C" w:sz="24"/>
@@ -4874,7 +4880,7 @@
       <w:tr>
         <w:tc>
           <w:tcPr>
-            <w:tcW w:type="pct" w:w="100%"/>
+            <w:tcW w:type="dxa" w:w="9000"/>
             <w:tcBorders>
               <w:top w:val="none" w:color="FFFFFF" w:sz="0"/>
               <w:left w:val="single" w:color="EA580C" w:sz="24"/>
@@ -4908,7 +4914,7 @@
       <w:tr>
         <w:tc>
           <w:tcPr>
-            <w:tcW w:type="pct" w:w="100%"/>
+            <w:tcW w:type="dxa" w:w="9000"/>
             <w:tcBorders>
               <w:top w:val="none" w:color="FFFFFF" w:sz="0"/>
               <w:left w:val="single" w:color="EA580C" w:sz="24"/>
@@ -4942,7 +4948,7 @@
       <w:tr>
         <w:tc>
           <w:tcPr>
-            <w:tcW w:type="pct" w:w="100%"/>
+            <w:tcW w:type="dxa" w:w="9000"/>
             <w:tcBorders>
               <w:top w:val="none" w:color="FFFFFF" w:sz="0"/>
               <w:left w:val="single" w:color="EA580C" w:sz="24"/>
@@ -4976,7 +4982,7 @@
       <w:tr>
         <w:tc>
           <w:tcPr>
-            <w:tcW w:type="pct" w:w="100%"/>
+            <w:tcW w:type="dxa" w:w="9000"/>
             <w:tcBorders>
               <w:top w:val="none" w:color="FFFFFF" w:sz="0"/>
               <w:left w:val="single" w:color="EA580C" w:sz="24"/>
@@ -5010,7 +5016,7 @@
       <w:tr>
         <w:tc>
           <w:tcPr>
-            <w:tcW w:type="pct" w:w="100%"/>
+            <w:tcW w:type="dxa" w:w="9000"/>
             <w:tcBorders>
               <w:top w:val="none" w:color="FFFFFF" w:sz="0"/>
               <w:left w:val="single" w:color="EA580C" w:sz="24"/>
@@ -5044,7 +5050,7 @@
       <w:tr>
         <w:tc>
           <w:tcPr>
-            <w:tcW w:type="pct" w:w="100%"/>
+            <w:tcW w:type="dxa" w:w="9000"/>
             <w:tcBorders>
               <w:top w:val="none" w:color="FFFFFF" w:sz="0"/>
               <w:left w:val="single" w:color="EA580C" w:sz="24"/>
@@ -5078,7 +5084,7 @@
       <w:tr>
         <w:tc>
           <w:tcPr>
-            <w:tcW w:type="pct" w:w="100%"/>
+            <w:tcW w:type="dxa" w:w="9000"/>
             <w:tcBorders>
               <w:top w:val="none" w:color="FFFFFF" w:sz="0"/>
               <w:left w:val="single" w:color="EA580C" w:sz="24"/>
@@ -5112,7 +5118,7 @@
       <w:tr>
         <w:tc>
           <w:tcPr>
-            <w:tcW w:type="pct" w:w="100%"/>
+            <w:tcW w:type="dxa" w:w="9000"/>
             <w:tcBorders>
               <w:top w:val="none" w:color="FFFFFF" w:sz="0"/>
               <w:left w:val="single" w:color="EA580C" w:sz="24"/>
@@ -5146,7 +5152,7 @@
       <w:tr>
         <w:tc>
           <w:tcPr>
-            <w:tcW w:type="pct" w:w="100%"/>
+            <w:tcW w:type="dxa" w:w="9000"/>
             <w:tcBorders>
               <w:top w:val="none" w:color="FFFFFF" w:sz="0"/>
               <w:left w:val="single" w:color="EA580C" w:sz="24"/>
@@ -5180,7 +5186,7 @@
       <w:tr>
         <w:tc>
           <w:tcPr>
-            <w:tcW w:type="pct" w:w="100%"/>
+            <w:tcW w:type="dxa" w:w="9000"/>
             <w:tcBorders>
               <w:top w:val="none" w:color="FFFFFF" w:sz="0"/>
               <w:left w:val="single" w:color="EA580C" w:sz="24"/>
@@ -5282,7 +5288,7 @@
     </w:p>
     <w:tbl>
       <w:tblPr>
-        <w:tblW w:type="pct" w:w="100%"/>
+        <w:tblW w:type="dxa" w:w="9000"/>
         <w:tblBorders>
           <w:top w:val="single" w:color="auto" w:sz="4"/>
           <w:left w:val="single" w:color="auto" w:sz="4"/>
@@ -5291,14 +5297,15 @@
           <w:insideH w:val="single" w:color="auto" w:sz="4"/>
           <w:insideV w:val="single" w:color="auto" w:sz="4"/>
         </w:tblBorders>
+        <w:tblLayout w:type="fixed"/>
       </w:tblPr>
       <w:tblGrid>
-        <w:gridCol w:w="100"/>
+        <w:gridCol w:w="9000"/>
       </w:tblGrid>
       <w:tr>
         <w:tc>
           <w:tcPr>
-            <w:tcW w:type="pct" w:w="100%"/>
+            <w:tcW w:type="dxa" w:w="9000"/>
             <w:tcBorders>
               <w:top w:val="none" w:color="FFFFFF" w:sz="0"/>
               <w:left w:val="none" w:color="FFFFFF" w:sz="0"/>
@@ -5334,7 +5341,7 @@
       <w:tr>
         <w:tc>
           <w:tcPr>
-            <w:tcW w:type="pct" w:w="100%"/>
+            <w:tcW w:type="dxa" w:w="9000"/>
             <w:tcBorders>
               <w:top w:val="none" w:color="FFFFFF" w:sz="0"/>
               <w:left w:val="single" w:color="EA580C" w:sz="24"/>
@@ -5368,7 +5375,7 @@
       <w:tr>
         <w:tc>
           <w:tcPr>
-            <w:tcW w:type="pct" w:w="100%"/>
+            <w:tcW w:type="dxa" w:w="9000"/>
             <w:tcBorders>
               <w:top w:val="none" w:color="FFFFFF" w:sz="0"/>
               <w:left w:val="single" w:color="EA580C" w:sz="24"/>
@@ -5402,7 +5409,7 @@
       <w:tr>
         <w:tc>
           <w:tcPr>
-            <w:tcW w:type="pct" w:w="100%"/>
+            <w:tcW w:type="dxa" w:w="9000"/>
             <w:tcBorders>
               <w:top w:val="none" w:color="FFFFFF" w:sz="0"/>
               <w:left w:val="single" w:color="EA580C" w:sz="24"/>
@@ -5436,7 +5443,7 @@
       <w:tr>
         <w:tc>
           <w:tcPr>
-            <w:tcW w:type="pct" w:w="100%"/>
+            <w:tcW w:type="dxa" w:w="9000"/>
             <w:tcBorders>
               <w:top w:val="none" w:color="FFFFFF" w:sz="0"/>
               <w:left w:val="single" w:color="EA580C" w:sz="24"/>
@@ -5470,7 +5477,7 @@
       <w:tr>
         <w:tc>
           <w:tcPr>
-            <w:tcW w:type="pct" w:w="100%"/>
+            <w:tcW w:type="dxa" w:w="9000"/>
             <w:tcBorders>
               <w:top w:val="none" w:color="FFFFFF" w:sz="0"/>
               <w:left w:val="single" w:color="EA580C" w:sz="24"/>
@@ -5504,7 +5511,7 @@
       <w:tr>
         <w:tc>
           <w:tcPr>
-            <w:tcW w:type="pct" w:w="100%"/>
+            <w:tcW w:type="dxa" w:w="9000"/>
             <w:tcBorders>
               <w:top w:val="none" w:color="FFFFFF" w:sz="0"/>
               <w:left w:val="single" w:color="EA580C" w:sz="24"/>
@@ -5538,7 +5545,7 @@
       <w:tr>
         <w:tc>
           <w:tcPr>
-            <w:tcW w:type="pct" w:w="100%"/>
+            <w:tcW w:type="dxa" w:w="9000"/>
             <w:tcBorders>
               <w:top w:val="none" w:color="FFFFFF" w:sz="0"/>
               <w:left w:val="single" w:color="EA580C" w:sz="24"/>
@@ -5572,7 +5579,7 @@
       <w:tr>
         <w:tc>
           <w:tcPr>
-            <w:tcW w:type="pct" w:w="100%"/>
+            <w:tcW w:type="dxa" w:w="9000"/>
             <w:tcBorders>
               <w:top w:val="none" w:color="FFFFFF" w:sz="0"/>
               <w:left w:val="single" w:color="EA580C" w:sz="24"/>
@@ -5606,7 +5613,7 @@
       <w:tr>
         <w:tc>
           <w:tcPr>
-            <w:tcW w:type="pct" w:w="100%"/>
+            <w:tcW w:type="dxa" w:w="9000"/>
             <w:tcBorders>
               <w:top w:val="none" w:color="FFFFFF" w:sz="0"/>
               <w:left w:val="single" w:color="EA580C" w:sz="24"/>
@@ -5640,7 +5647,7 @@
       <w:tr>
         <w:tc>
           <w:tcPr>
-            <w:tcW w:type="pct" w:w="100%"/>
+            <w:tcW w:type="dxa" w:w="9000"/>
             <w:tcBorders>
               <w:top w:val="none" w:color="FFFFFF" w:sz="0"/>
               <w:left w:val="single" w:color="EA580C" w:sz="24"/>
@@ -5674,7 +5681,7 @@
       <w:tr>
         <w:tc>
           <w:tcPr>
-            <w:tcW w:type="pct" w:w="100%"/>
+            <w:tcW w:type="dxa" w:w="9000"/>
             <w:tcBorders>
               <w:top w:val="none" w:color="FFFFFF" w:sz="0"/>
               <w:left w:val="single" w:color="EA580C" w:sz="24"/>
@@ -5708,7 +5715,7 @@
       <w:tr>
         <w:tc>
           <w:tcPr>
-            <w:tcW w:type="pct" w:w="100%"/>
+            <w:tcW w:type="dxa" w:w="9000"/>
             <w:tcBorders>
               <w:top w:val="none" w:color="FFFFFF" w:sz="0"/>
               <w:left w:val="single" w:color="EA580C" w:sz="24"/>
@@ -5742,7 +5749,7 @@
       <w:tr>
         <w:tc>
           <w:tcPr>
-            <w:tcW w:type="pct" w:w="100%"/>
+            <w:tcW w:type="dxa" w:w="9000"/>
             <w:tcBorders>
               <w:top w:val="none" w:color="FFFFFF" w:sz="0"/>
               <w:left w:val="single" w:color="EA580C" w:sz="24"/>
@@ -5776,7 +5783,7 @@
       <w:tr>
         <w:tc>
           <w:tcPr>
-            <w:tcW w:type="pct" w:w="100%"/>
+            <w:tcW w:type="dxa" w:w="9000"/>
             <w:tcBorders>
               <w:top w:val="none" w:color="FFFFFF" w:sz="0"/>
               <w:left w:val="single" w:color="EA580C" w:sz="24"/>
@@ -5810,7 +5817,7 @@
       <w:tr>
         <w:tc>
           <w:tcPr>
-            <w:tcW w:type="pct" w:w="100%"/>
+            <w:tcW w:type="dxa" w:w="9000"/>
             <w:tcBorders>
               <w:top w:val="none" w:color="FFFFFF" w:sz="0"/>
               <w:left w:val="single" w:color="EA580C" w:sz="24"/>
@@ -5844,7 +5851,7 @@
       <w:tr>
         <w:tc>
           <w:tcPr>
-            <w:tcW w:type="pct" w:w="100%"/>
+            <w:tcW w:type="dxa" w:w="9000"/>
             <w:tcBorders>
               <w:top w:val="none" w:color="FFFFFF" w:sz="0"/>
               <w:left w:val="single" w:color="EA580C" w:sz="24"/>
@@ -5878,7 +5885,7 @@
       <w:tr>
         <w:tc>
           <w:tcPr>
-            <w:tcW w:type="pct" w:w="100%"/>
+            <w:tcW w:type="dxa" w:w="9000"/>
             <w:tcBorders>
               <w:top w:val="none" w:color="FFFFFF" w:sz="0"/>
               <w:left w:val="single" w:color="EA580C" w:sz="24"/>
@@ -5912,7 +5919,7 @@
       <w:tr>
         <w:tc>
           <w:tcPr>
-            <w:tcW w:type="pct" w:w="100%"/>
+            <w:tcW w:type="dxa" w:w="9000"/>
             <w:tcBorders>
               <w:top w:val="none" w:color="FFFFFF" w:sz="0"/>
               <w:left w:val="single" w:color="EA580C" w:sz="24"/>
@@ -5946,7 +5953,7 @@
       <w:tr>
         <w:tc>
           <w:tcPr>
-            <w:tcW w:type="pct" w:w="100%"/>
+            <w:tcW w:type="dxa" w:w="9000"/>
             <w:tcBorders>
               <w:top w:val="none" w:color="FFFFFF" w:sz="0"/>
               <w:left w:val="single" w:color="EA580C" w:sz="24"/>
@@ -5980,7 +5987,7 @@
       <w:tr>
         <w:tc>
           <w:tcPr>
-            <w:tcW w:type="pct" w:w="100%"/>
+            <w:tcW w:type="dxa" w:w="9000"/>
             <w:tcBorders>
               <w:top w:val="none" w:color="FFFFFF" w:sz="0"/>
               <w:left w:val="single" w:color="EA580C" w:sz="24"/>
@@ -6014,7 +6021,7 @@
       <w:tr>
         <w:tc>
           <w:tcPr>
-            <w:tcW w:type="pct" w:w="100%"/>
+            <w:tcW w:type="dxa" w:w="9000"/>
             <w:tcBorders>
               <w:top w:val="none" w:color="FFFFFF" w:sz="0"/>
               <w:left w:val="single" w:color="EA580C" w:sz="24"/>
@@ -6048,7 +6055,7 @@
       <w:tr>
         <w:tc>
           <w:tcPr>
-            <w:tcW w:type="pct" w:w="100%"/>
+            <w:tcW w:type="dxa" w:w="9000"/>
             <w:tcBorders>
               <w:top w:val="none" w:color="FFFFFF" w:sz="0"/>
               <w:left w:val="single" w:color="EA580C" w:sz="24"/>
@@ -6082,7 +6089,7 @@
       <w:tr>
         <w:tc>
           <w:tcPr>
-            <w:tcW w:type="pct" w:w="100%"/>
+            <w:tcW w:type="dxa" w:w="9000"/>
             <w:tcBorders>
               <w:top w:val="none" w:color="FFFFFF" w:sz="0"/>
               <w:left w:val="single" w:color="EA580C" w:sz="24"/>
@@ -6169,7 +6176,7 @@
     </w:p>
     <w:tbl>
       <w:tblPr>
-        <w:tblW w:type="pct" w:w="100%"/>
+        <w:tblW w:type="dxa" w:w="9000"/>
         <w:tblBorders>
           <w:top w:val="single" w:color="CBD5E1" w:sz="4"/>
           <w:left w:val="single" w:color="CBD5E1" w:sz="4"/>
@@ -6178,10 +6185,11 @@
           <w:insideH w:val="single" w:color="CBD5E1" w:sz="4"/>
           <w:insideV w:val="single" w:color="CBD5E1" w:sz="4"/>
         </w:tblBorders>
+        <w:tblLayout w:type="fixed"/>
       </w:tblPr>
       <w:tblGrid>
-        <w:gridCol w:w="100"/>
-        <w:gridCol w:w="100"/>
+        <w:gridCol w:w="2520"/>
+        <w:gridCol w:w="6480"/>
       </w:tblGrid>
       <w:tr>
         <w:trPr>
@@ -6189,7 +6197,7 @@
         </w:trPr>
         <w:tc>
           <w:tcPr>
-            <w:tcW w:type="pct" w:w="28%"/>
+            <w:tcW w:type="dxa" w:w="2520"/>
             <w:shd w:fill="1F2937" w:val="clear"/>
             <w:tcMar>
               <w:top w:type="dxa" w:w="100"/>
@@ -6218,7 +6226,7 @@
         </w:tc>
         <w:tc>
           <w:tcPr>
-            <w:tcW w:type="pct" w:w="72%"/>
+            <w:tcW w:type="dxa" w:w="6480"/>
             <w:shd w:fill="1F2937" w:val="clear"/>
             <w:tcMar>
               <w:top w:type="dxa" w:w="100"/>
@@ -6249,7 +6257,7 @@
       <w:tr>
         <w:tc>
           <w:tcPr>
-            <w:tcW w:type="pct" w:w="28%"/>
+            <w:tcW w:type="dxa" w:w="2520"/>
             <w:tcMar>
               <w:top w:type="dxa" w:w="80"/>
               <w:left w:type="dxa" w:w="140"/>
@@ -6275,7 +6283,7 @@
         </w:tc>
         <w:tc>
           <w:tcPr>
-            <w:tcW w:type="pct" w:w="72%"/>
+            <w:tcW w:type="dxa" w:w="6480"/>
             <w:tcMar>
               <w:top w:type="dxa" w:w="80"/>
               <w:left w:type="dxa" w:w="140"/>
@@ -6303,7 +6311,7 @@
       <w:tr>
         <w:tc>
           <w:tcPr>
-            <w:tcW w:type="pct" w:w="28%"/>
+            <w:tcW w:type="dxa" w:w="2520"/>
             <w:shd w:fill="F8FAFC" w:val="clear"/>
             <w:tcMar>
               <w:top w:type="dxa" w:w="80"/>
@@ -6330,7 +6338,7 @@
         </w:tc>
         <w:tc>
           <w:tcPr>
-            <w:tcW w:type="pct" w:w="72%"/>
+            <w:tcW w:type="dxa" w:w="6480"/>
             <w:shd w:fill="F8FAFC" w:val="clear"/>
             <w:tcMar>
               <w:top w:type="dxa" w:w="80"/>
@@ -6359,7 +6367,7 @@
       <w:tr>
         <w:tc>
           <w:tcPr>
-            <w:tcW w:type="pct" w:w="28%"/>
+            <w:tcW w:type="dxa" w:w="2520"/>
             <w:tcMar>
               <w:top w:type="dxa" w:w="80"/>
               <w:left w:type="dxa" w:w="140"/>
@@ -6385,7 +6393,7 @@
         </w:tc>
         <w:tc>
           <w:tcPr>
-            <w:tcW w:type="pct" w:w="72%"/>
+            <w:tcW w:type="dxa" w:w="6480"/>
             <w:tcMar>
               <w:top w:type="dxa" w:w="80"/>
               <w:left w:type="dxa" w:w="140"/>
@@ -6413,7 +6421,7 @@
       <w:tr>
         <w:tc>
           <w:tcPr>
-            <w:tcW w:type="pct" w:w="28%"/>
+            <w:tcW w:type="dxa" w:w="2520"/>
             <w:shd w:fill="F8FAFC" w:val="clear"/>
             <w:tcMar>
               <w:top w:type="dxa" w:w="80"/>
@@ -6440,7 +6448,7 @@
         </w:tc>
         <w:tc>
           <w:tcPr>
-            <w:tcW w:type="pct" w:w="72%"/>
+            <w:tcW w:type="dxa" w:w="6480"/>
             <w:shd w:fill="F8FAFC" w:val="clear"/>
             <w:tcMar>
               <w:top w:type="dxa" w:w="80"/>
@@ -6469,7 +6477,7 @@
       <w:tr>
         <w:tc>
           <w:tcPr>
-            <w:tcW w:type="pct" w:w="28%"/>
+            <w:tcW w:type="dxa" w:w="2520"/>
             <w:tcMar>
               <w:top w:type="dxa" w:w="80"/>
               <w:left w:type="dxa" w:w="140"/>
@@ -6495,7 +6503,7 @@
         </w:tc>
         <w:tc>
           <w:tcPr>
-            <w:tcW w:type="pct" w:w="72%"/>
+            <w:tcW w:type="dxa" w:w="6480"/>
             <w:tcMar>
               <w:top w:type="dxa" w:w="80"/>
               <w:left w:type="dxa" w:w="140"/>
@@ -6523,7 +6531,7 @@
       <w:tr>
         <w:tc>
           <w:tcPr>
-            <w:tcW w:type="pct" w:w="28%"/>
+            <w:tcW w:type="dxa" w:w="2520"/>
             <w:shd w:fill="F8FAFC" w:val="clear"/>
             <w:tcMar>
               <w:top w:type="dxa" w:w="80"/>
@@ -6550,7 +6558,7 @@
         </w:tc>
         <w:tc>
           <w:tcPr>
-            <w:tcW w:type="pct" w:w="72%"/>
+            <w:tcW w:type="dxa" w:w="6480"/>
             <w:shd w:fill="F8FAFC" w:val="clear"/>
             <w:tcMar>
               <w:top w:type="dxa" w:w="80"/>
@@ -6647,7 +6655,7 @@
     </w:p>
     <w:tbl>
       <w:tblPr>
-        <w:tblW w:type="pct" w:w="100%"/>
+        <w:tblW w:type="dxa" w:w="9000"/>
         <w:tblBorders>
           <w:top w:val="single" w:color="CBD5E1" w:sz="4"/>
           <w:left w:val="single" w:color="CBD5E1" w:sz="4"/>
@@ -6656,11 +6664,12 @@
           <w:insideH w:val="single" w:color="CBD5E1" w:sz="4"/>
           <w:insideV w:val="single" w:color="CBD5E1" w:sz="4"/>
         </w:tblBorders>
+        <w:tblLayout w:type="fixed"/>
       </w:tblPr>
       <w:tblGrid>
-        <w:gridCol w:w="100"/>
-        <w:gridCol w:w="100"/>
-        <w:gridCol w:w="100"/>
+        <w:gridCol w:w="1980"/>
+        <w:gridCol w:w="3420"/>
+        <w:gridCol w:w="3600"/>
       </w:tblGrid>
       <w:tr>
         <w:trPr>
@@ -6668,7 +6677,7 @@
         </w:trPr>
         <w:tc>
           <w:tcPr>
-            <w:tcW w:type="pct" w:w="22%"/>
+            <w:tcW w:type="dxa" w:w="1980"/>
             <w:shd w:fill="1F2937" w:val="clear"/>
             <w:tcMar>
               <w:top w:type="dxa" w:w="100"/>
@@ -6697,7 +6706,7 @@
         </w:tc>
         <w:tc>
           <w:tcPr>
-            <w:tcW w:type="pct" w:w="38%"/>
+            <w:tcW w:type="dxa" w:w="3420"/>
             <w:shd w:fill="1F2937" w:val="clear"/>
             <w:tcMar>
               <w:top w:type="dxa" w:w="100"/>
@@ -6726,7 +6735,7 @@
         </w:tc>
         <w:tc>
           <w:tcPr>
-            <w:tcW w:type="pct" w:w="40%"/>
+            <w:tcW w:type="dxa" w:w="3600"/>
             <w:shd w:fill="1F2937" w:val="clear"/>
             <w:tcMar>
               <w:top w:type="dxa" w:w="100"/>
@@ -6757,7 +6766,7 @@
       <w:tr>
         <w:tc>
           <w:tcPr>
-            <w:tcW w:type="pct" w:w="22%"/>
+            <w:tcW w:type="dxa" w:w="1980"/>
             <w:tcMar>
               <w:top w:type="dxa" w:w="80"/>
               <w:left w:type="dxa" w:w="140"/>
@@ -6783,7 +6792,7 @@
         </w:tc>
         <w:tc>
           <w:tcPr>
-            <w:tcW w:type="pct" w:w="38%"/>
+            <w:tcW w:type="dxa" w:w="3420"/>
             <w:tcMar>
               <w:top w:type="dxa" w:w="80"/>
               <w:left w:type="dxa" w:w="140"/>
@@ -6809,7 +6818,7 @@
         </w:tc>
         <w:tc>
           <w:tcPr>
-            <w:tcW w:type="pct" w:w="40%"/>
+            <w:tcW w:type="dxa" w:w="3600"/>
             <w:tcMar>
               <w:top w:type="dxa" w:w="80"/>
               <w:left w:type="dxa" w:w="140"/>
@@ -6837,7 +6846,7 @@
       <w:tr>
         <w:tc>
           <w:tcPr>
-            <w:tcW w:type="pct" w:w="22%"/>
+            <w:tcW w:type="dxa" w:w="1980"/>
             <w:shd w:fill="F8FAFC" w:val="clear"/>
             <w:tcMar>
               <w:top w:type="dxa" w:w="80"/>
@@ -6864,7 +6873,7 @@
         </w:tc>
         <w:tc>
           <w:tcPr>
-            <w:tcW w:type="pct" w:w="38%"/>
+            <w:tcW w:type="dxa" w:w="3420"/>
             <w:shd w:fill="F8FAFC" w:val="clear"/>
             <w:tcMar>
               <w:top w:type="dxa" w:w="80"/>
@@ -6891,7 +6900,7 @@
         </w:tc>
         <w:tc>
           <w:tcPr>
-            <w:tcW w:type="pct" w:w="40%"/>
+            <w:tcW w:type="dxa" w:w="3600"/>
             <w:shd w:fill="F8FAFC" w:val="clear"/>
             <w:tcMar>
               <w:top w:type="dxa" w:w="80"/>
@@ -6920,7 +6929,7 @@
       <w:tr>
         <w:tc>
           <w:tcPr>
-            <w:tcW w:type="pct" w:w="22%"/>
+            <w:tcW w:type="dxa" w:w="1980"/>
             <w:tcMar>
               <w:top w:type="dxa" w:w="80"/>
               <w:left w:type="dxa" w:w="140"/>
@@ -6946,7 +6955,7 @@
         </w:tc>
         <w:tc>
           <w:tcPr>
-            <w:tcW w:type="pct" w:w="38%"/>
+            <w:tcW w:type="dxa" w:w="3420"/>
             <w:tcMar>
               <w:top w:type="dxa" w:w="80"/>
               <w:left w:type="dxa" w:w="140"/>
@@ -6972,7 +6981,7 @@
         </w:tc>
         <w:tc>
           <w:tcPr>
-            <w:tcW w:type="pct" w:w="40%"/>
+            <w:tcW w:type="dxa" w:w="3600"/>
             <w:tcMar>
               <w:top w:type="dxa" w:w="80"/>
               <w:left w:type="dxa" w:w="140"/>
@@ -7020,7 +7029,7 @@
     </w:p>
     <w:tbl>
       <w:tblPr>
-        <w:tblW w:type="pct" w:w="100%"/>
+        <w:tblW w:type="dxa" w:w="9000"/>
         <w:tblBorders>
           <w:top w:val="single" w:color="auto" w:sz="4"/>
           <w:left w:val="single" w:color="auto" w:sz="4"/>
@@ -7029,14 +7038,15 @@
           <w:insideH w:val="single" w:color="auto" w:sz="4"/>
           <w:insideV w:val="single" w:color="auto" w:sz="4"/>
         </w:tblBorders>
+        <w:tblLayout w:type="fixed"/>
       </w:tblPr>
       <w:tblGrid>
-        <w:gridCol w:w="100"/>
+        <w:gridCol w:w="9000"/>
       </w:tblGrid>
       <w:tr>
         <w:tc>
           <w:tcPr>
-            <w:tcW w:type="pct" w:w="100%"/>
+            <w:tcW w:type="dxa" w:w="9000"/>
             <w:tcBorders>
               <w:top w:val="none" w:color="FFFFFF" w:sz="0"/>
               <w:left w:val="none" w:color="FFFFFF" w:sz="0"/>
@@ -7072,7 +7082,7 @@
       <w:tr>
         <w:tc>
           <w:tcPr>
-            <w:tcW w:type="pct" w:w="100%"/>
+            <w:tcW w:type="dxa" w:w="9000"/>
             <w:tcBorders>
               <w:top w:val="none" w:color="FFFFFF" w:sz="0"/>
               <w:left w:val="single" w:color="EA580C" w:sz="24"/>
@@ -7106,7 +7116,7 @@
       <w:tr>
         <w:tc>
           <w:tcPr>
-            <w:tcW w:type="pct" w:w="100%"/>
+            <w:tcW w:type="dxa" w:w="9000"/>
             <w:tcBorders>
               <w:top w:val="none" w:color="FFFFFF" w:sz="0"/>
               <w:left w:val="single" w:color="EA580C" w:sz="24"/>
@@ -7140,7 +7150,7 @@
       <w:tr>
         <w:tc>
           <w:tcPr>
-            <w:tcW w:type="pct" w:w="100%"/>
+            <w:tcW w:type="dxa" w:w="9000"/>
             <w:tcBorders>
               <w:top w:val="none" w:color="FFFFFF" w:sz="0"/>
               <w:left w:val="single" w:color="EA580C" w:sz="24"/>
@@ -7174,7 +7184,7 @@
       <w:tr>
         <w:tc>
           <w:tcPr>
-            <w:tcW w:type="pct" w:w="100%"/>
+            <w:tcW w:type="dxa" w:w="9000"/>
             <w:tcBorders>
               <w:top w:val="none" w:color="FFFFFF" w:sz="0"/>
               <w:left w:val="single" w:color="EA580C" w:sz="24"/>
@@ -7208,7 +7218,7 @@
       <w:tr>
         <w:tc>
           <w:tcPr>
-            <w:tcW w:type="pct" w:w="100%"/>
+            <w:tcW w:type="dxa" w:w="9000"/>
             <w:tcBorders>
               <w:top w:val="none" w:color="FFFFFF" w:sz="0"/>
               <w:left w:val="single" w:color="EA580C" w:sz="24"/>
@@ -7242,7 +7252,7 @@
       <w:tr>
         <w:tc>
           <w:tcPr>
-            <w:tcW w:type="pct" w:w="100%"/>
+            <w:tcW w:type="dxa" w:w="9000"/>
             <w:tcBorders>
               <w:top w:val="none" w:color="FFFFFF" w:sz="0"/>
               <w:left w:val="single" w:color="EA580C" w:sz="24"/>
@@ -7276,7 +7286,7 @@
       <w:tr>
         <w:tc>
           <w:tcPr>
-            <w:tcW w:type="pct" w:w="100%"/>
+            <w:tcW w:type="dxa" w:w="9000"/>
             <w:tcBorders>
               <w:top w:val="none" w:color="FFFFFF" w:sz="0"/>
               <w:left w:val="single" w:color="EA580C" w:sz="24"/>
@@ -7310,7 +7320,7 @@
       <w:tr>
         <w:tc>
           <w:tcPr>
-            <w:tcW w:type="pct" w:w="100%"/>
+            <w:tcW w:type="dxa" w:w="9000"/>
             <w:tcBorders>
               <w:top w:val="none" w:color="FFFFFF" w:sz="0"/>
               <w:left w:val="single" w:color="EA580C" w:sz="24"/>
@@ -7344,7 +7354,7 @@
       <w:tr>
         <w:tc>
           <w:tcPr>
-            <w:tcW w:type="pct" w:w="100%"/>
+            <w:tcW w:type="dxa" w:w="9000"/>
             <w:tcBorders>
               <w:top w:val="none" w:color="FFFFFF" w:sz="0"/>
               <w:left w:val="single" w:color="EA580C" w:sz="24"/>
@@ -7378,7 +7388,7 @@
       <w:tr>
         <w:tc>
           <w:tcPr>
-            <w:tcW w:type="pct" w:w="100%"/>
+            <w:tcW w:type="dxa" w:w="9000"/>
             <w:tcBorders>
               <w:top w:val="none" w:color="FFFFFF" w:sz="0"/>
               <w:left w:val="single" w:color="EA580C" w:sz="24"/>
@@ -7412,7 +7422,7 @@
       <w:tr>
         <w:tc>
           <w:tcPr>
-            <w:tcW w:type="pct" w:w="100%"/>
+            <w:tcW w:type="dxa" w:w="9000"/>
             <w:tcBorders>
               <w:top w:val="none" w:color="FFFFFF" w:sz="0"/>
               <w:left w:val="single" w:color="EA580C" w:sz="24"/>
@@ -7446,7 +7456,7 @@
       <w:tr>
         <w:tc>
           <w:tcPr>
-            <w:tcW w:type="pct" w:w="100%"/>
+            <w:tcW w:type="dxa" w:w="9000"/>
             <w:tcBorders>
               <w:top w:val="none" w:color="FFFFFF" w:sz="0"/>
               <w:left w:val="single" w:color="EA580C" w:sz="24"/>

</xml_diff>